<commit_message>
Prise en main testeur module 1
</commit_message>
<xml_diff>
--- a/Algorithmique/Introduction_Algo_M1.docx
+++ b/Algorithmique/Introduction_Algo_M1.docx
@@ -32,21 +32,10 @@
         <w:t xml:space="preserve">Cours </w:t>
       </w:r>
       <w:r>
-        <w:t>ENI « Introduction</w:t>
+        <w:t xml:space="preserve">ENI « </w:t>
       </w:r>
       <w:r>
-        <w:rPr>
-          <w:b/>
-          <w:bCs/>
-        </w:rPr>
-        <w:t xml:space="preserve"> à </w:t>
-      </w:r>
-      <w:r>
-        <w:rPr>
-          <w:b/>
-          <w:bCs/>
-        </w:rPr>
-        <w:t>l’Algorithmique</w:t>
+        <w:t>prise en main du métier de testeur</w:t>
       </w:r>
       <w:r>
         <w:t xml:space="preserve"> »</w:t>
@@ -541,68 +530,28 @@
     </w:p>
     <w:p>
       <w:pPr>
-        <w:rPr>
-          <w:rFonts w:asciiTheme="majorHAnsi" w:eastAsiaTheme="majorEastAsia" w:hAnsiTheme="majorHAnsi" w:cstheme="majorBidi"/>
-          <w:b/>
-          <w:bCs/>
-          <w:color w:val="0F4761" w:themeColor="accent1" w:themeShade="BF"/>
-          <w:sz w:val="40"/>
-          <w:szCs w:val="40"/>
-        </w:rPr>
+        <w:pStyle w:val="Titre1"/>
       </w:pPr>
       <w:r>
-        <w:rPr>
-          <w:rFonts w:asciiTheme="majorHAnsi" w:eastAsiaTheme="majorEastAsia" w:hAnsiTheme="majorHAnsi" w:cstheme="majorBidi"/>
-          <w:b/>
-          <w:bCs/>
-          <w:color w:val="0F4761" w:themeColor="accent1" w:themeShade="BF"/>
-          <w:sz w:val="40"/>
-          <w:szCs w:val="40"/>
-        </w:rPr>
         <w:lastRenderedPageBreak/>
-        <w:t>Qu'est-ce que l'algorithmique ?</w:t>
+        <w:t>Tester</w:t>
+      </w:r>
+    </w:p>
+    <w:p>
+      <w:pPr>
+        <w:pStyle w:val="Titre2"/>
+      </w:pPr>
+      <w:r>
+        <w:t>Qui teste ?</w:t>
       </w:r>
     </w:p>
     <w:p>
       <w:r>
-        <w:rPr>
-          <w:b/>
-          <w:bCs/>
-        </w:rPr>
-        <w:t>Un algorithme</w:t>
-      </w:r>
-      <w:r>
-        <w:t xml:space="preserve"> désigne une suite finie d’actions simples ou basiques qui, une fois assemblées, permettent de résoudre une action complexe. </w:t>
-      </w:r>
-    </w:p>
-    <w:p>
-      <w:r>
-        <w:t>En d’autres termes, c’est une méthode structurée pour résoudre un problème donné.</w:t>
-      </w:r>
-    </w:p>
-    <w:p>
-      <w:r>
-        <w:t>L’algorithme est d’abord rédigé en langage commun, compréhensible par les humains. Ensuite, il est traduit en langage de programmation, de manière à être exécutable par un ordinateur. </w:t>
-      </w:r>
-    </w:p>
-    <w:p/>
-    <w:p>
-      <w:pPr>
-        <w:pStyle w:val="Titre2"/>
-      </w:pPr>
-      <w:bookmarkStart w:id="0" w:name="_Toc230679305"/>
-      <w:r>
-        <w:t>Exemples « d’Algo » dans la vie de tous les jours</w:t>
-      </w:r>
-      <w:bookmarkEnd w:id="0"/>
-    </w:p>
-    <w:p>
-      <w:r>
         <w:drawing>
-          <wp:inline distT="0" distB="0" distL="0" distR="0" wp14:anchorId="10355AEA" wp14:editId="18E4C8CD">
-            <wp:extent cx="5760720" cy="3016250"/>
-            <wp:effectExtent l="0" t="0" r="0" b="0"/>
-            <wp:docPr id="551247954" name="Image 1"/>
+          <wp:inline distT="0" distB="0" distL="0" distR="0" wp14:anchorId="0FC4170C" wp14:editId="02DB9B9B">
+            <wp:extent cx="6248400" cy="3139440"/>
+            <wp:effectExtent l="0" t="0" r="0" b="3810"/>
+            <wp:docPr id="1898448549" name="Image 1"/>
             <wp:cNvGraphicFramePr>
               <a:graphicFrameLocks xmlns:a="http://schemas.openxmlformats.org/drawingml/2006/main" noChangeAspect="1"/>
             </wp:cNvGraphicFramePr>
@@ -610,7 +559,7 @@
               <a:graphicData uri="http://schemas.openxmlformats.org/drawingml/2006/picture">
                 <pic:pic xmlns:pic="http://schemas.openxmlformats.org/drawingml/2006/picture">
                   <pic:nvPicPr>
-                    <pic:cNvPr id="551247954" name=""/>
+                    <pic:cNvPr id="1898448549" name=""/>
                     <pic:cNvPicPr/>
                   </pic:nvPicPr>
                   <pic:blipFill>
@@ -622,99 +571,7 @@
                   <pic:spPr>
                     <a:xfrm>
                       <a:off x="0" y="0"/>
-                      <a:ext cx="5760720" cy="3016250"/>
-                    </a:xfrm>
-                    <a:prstGeom prst="rect">
-                      <a:avLst/>
-                    </a:prstGeom>
-                  </pic:spPr>
-                </pic:pic>
-              </a:graphicData>
-            </a:graphic>
-          </wp:inline>
-        </w:drawing>
-      </w:r>
-    </w:p>
-    <w:p>
-      <w:r>
-        <w:drawing>
-          <wp:inline distT="0" distB="0" distL="0" distR="0" wp14:anchorId="3C4A4666" wp14:editId="7C091A0B">
-            <wp:extent cx="5760720" cy="3002280"/>
-            <wp:effectExtent l="0" t="0" r="0" b="7620"/>
-            <wp:docPr id="1119928361" name="Image 1"/>
-            <wp:cNvGraphicFramePr>
-              <a:graphicFrameLocks xmlns:a="http://schemas.openxmlformats.org/drawingml/2006/main" noChangeAspect="1"/>
-            </wp:cNvGraphicFramePr>
-            <a:graphic xmlns:a="http://schemas.openxmlformats.org/drawingml/2006/main">
-              <a:graphicData uri="http://schemas.openxmlformats.org/drawingml/2006/picture">
-                <pic:pic xmlns:pic="http://schemas.openxmlformats.org/drawingml/2006/picture">
-                  <pic:nvPicPr>
-                    <pic:cNvPr id="1119928361" name=""/>
-                    <pic:cNvPicPr/>
-                  </pic:nvPicPr>
-                  <pic:blipFill>
-                    <a:blip r:embed="rId10"/>
-                    <a:stretch>
-                      <a:fillRect/>
-                    </a:stretch>
-                  </pic:blipFill>
-                  <pic:spPr>
-                    <a:xfrm>
-                      <a:off x="0" y="0"/>
-                      <a:ext cx="5760720" cy="3002280"/>
-                    </a:xfrm>
-                    <a:prstGeom prst="rect">
-                      <a:avLst/>
-                    </a:prstGeom>
-                  </pic:spPr>
-                </pic:pic>
-              </a:graphicData>
-            </a:graphic>
-          </wp:inline>
-        </w:drawing>
-      </w:r>
-    </w:p>
-    <w:p/>
-    <w:p>
-      <w:pPr>
-        <w:rPr>
-          <w:rFonts w:asciiTheme="majorHAnsi" w:eastAsiaTheme="majorEastAsia" w:hAnsiTheme="majorHAnsi" w:cstheme="majorBidi"/>
-          <w:b/>
-          <w:bCs/>
-          <w:color w:val="0F4761" w:themeColor="accent1" w:themeShade="BF"/>
-          <w:sz w:val="40"/>
-          <w:szCs w:val="40"/>
-        </w:rPr>
-      </w:pPr>
-    </w:p>
-    <w:p/>
-    <w:p>
-      <w:r>
-        <w:drawing>
-          <wp:inline distT="0" distB="0" distL="0" distR="0" wp14:anchorId="5A3C9F06" wp14:editId="76383D0E">
-            <wp:extent cx="5760720" cy="4334510"/>
-            <wp:effectExtent l="0" t="0" r="0" b="8890"/>
-            <wp:docPr id="1973727206" name="Image 1"/>
-            <wp:cNvGraphicFramePr>
-              <a:graphicFrameLocks xmlns:a="http://schemas.openxmlformats.org/drawingml/2006/main" noChangeAspect="1"/>
-            </wp:cNvGraphicFramePr>
-            <a:graphic xmlns:a="http://schemas.openxmlformats.org/drawingml/2006/main">
-              <a:graphicData uri="http://schemas.openxmlformats.org/drawingml/2006/picture">
-                <pic:pic xmlns:pic="http://schemas.openxmlformats.org/drawingml/2006/picture">
-                  <pic:nvPicPr>
-                    <pic:cNvPr id="1973727206" name=""/>
-                    <pic:cNvPicPr/>
-                  </pic:nvPicPr>
-                  <pic:blipFill>
-                    <a:blip r:embed="rId11"/>
-                    <a:stretch>
-                      <a:fillRect/>
-                    </a:stretch>
-                  </pic:blipFill>
-                  <pic:spPr>
-                    <a:xfrm>
-                      <a:off x="0" y="0"/>
-                      <a:ext cx="5760720" cy="4334510"/>
+                      <a:ext cx="6248400" cy="3139440"/>
                     </a:xfrm>
                     <a:prstGeom prst="rect">
                       <a:avLst/>
@@ -731,209 +588,19 @@
     <w:p/>
     <w:p>
       <w:pPr>
+        <w:pStyle w:val="Titre1"/>
+      </w:pPr>
+    </w:p>
+    <w:p>
+      <w:pPr>
         <w:rPr>
           <w:noProof/>
         </w:rPr>
       </w:pPr>
     </w:p>
-    <w:p>
-      <w:pPr>
-        <w:rPr>
-          <w:noProof/>
-        </w:rPr>
-      </w:pPr>
-    </w:p>
-    <w:p>
-      <w:pPr>
-        <w:rPr>
-          <w:noProof/>
-        </w:rPr>
-      </w:pPr>
-    </w:p>
-    <w:p>
-      <w:pPr>
-        <w:rPr>
-          <w:noProof/>
-        </w:rPr>
-      </w:pPr>
-    </w:p>
-    <w:p/>
-    <w:p/>
-    <w:p/>
-    <w:p>
-      <w:pPr>
-        <w:pStyle w:val="Titre1"/>
-      </w:pPr>
-      <w:r>
-        <w:lastRenderedPageBreak/>
-        <w:t xml:space="preserve"> </w:t>
-      </w:r>
-      <w:bookmarkStart w:id="1" w:name="_Toc230679306"/>
-      <w:r>
-        <w:t>Définition et objectif de l’algorithmique</w:t>
-      </w:r>
-      <w:bookmarkEnd w:id="1"/>
-    </w:p>
-    <w:p/>
-    <w:p>
-      <w:r>
-        <w:drawing>
-          <wp:inline distT="0" distB="0" distL="0" distR="0" wp14:anchorId="31226FB5" wp14:editId="1FA13BDD">
-            <wp:extent cx="5760720" cy="3198495"/>
-            <wp:effectExtent l="0" t="0" r="0" b="1905"/>
-            <wp:docPr id="2114288598" name="Image 1"/>
-            <wp:cNvGraphicFramePr>
-              <a:graphicFrameLocks xmlns:a="http://schemas.openxmlformats.org/drawingml/2006/main" noChangeAspect="1"/>
-            </wp:cNvGraphicFramePr>
-            <a:graphic xmlns:a="http://schemas.openxmlformats.org/drawingml/2006/main">
-              <a:graphicData uri="http://schemas.openxmlformats.org/drawingml/2006/picture">
-                <pic:pic xmlns:pic="http://schemas.openxmlformats.org/drawingml/2006/picture">
-                  <pic:nvPicPr>
-                    <pic:cNvPr id="2114288598" name=""/>
-                    <pic:cNvPicPr/>
-                  </pic:nvPicPr>
-                  <pic:blipFill>
-                    <a:blip r:embed="rId12"/>
-                    <a:stretch>
-                      <a:fillRect/>
-                    </a:stretch>
-                  </pic:blipFill>
-                  <pic:spPr>
-                    <a:xfrm>
-                      <a:off x="0" y="0"/>
-                      <a:ext cx="5760720" cy="3198495"/>
-                    </a:xfrm>
-                    <a:prstGeom prst="rect">
-                      <a:avLst/>
-                    </a:prstGeom>
-                  </pic:spPr>
-                </pic:pic>
-              </a:graphicData>
-            </a:graphic>
-          </wp:inline>
-        </w:drawing>
-      </w:r>
-    </w:p>
-    <w:p/>
-    <w:p>
-      <w:pPr>
-        <w:pStyle w:val="Titre1"/>
-      </w:pPr>
-      <w:bookmarkStart w:id="2" w:name="_Toc230679307"/>
-      <w:r>
-        <w:t>Buts de l’algorithmique</w:t>
-      </w:r>
-      <w:bookmarkEnd w:id="2"/>
-    </w:p>
-    <w:p>
-      <w:r>
-        <w:drawing>
-          <wp:inline distT="0" distB="0" distL="0" distR="0" wp14:anchorId="03273603" wp14:editId="669E5A12">
-            <wp:extent cx="5760720" cy="2471420"/>
-            <wp:effectExtent l="0" t="0" r="0" b="5080"/>
-            <wp:docPr id="914000683" name="Image 1"/>
-            <wp:cNvGraphicFramePr>
-              <a:graphicFrameLocks xmlns:a="http://schemas.openxmlformats.org/drawingml/2006/main" noChangeAspect="1"/>
-            </wp:cNvGraphicFramePr>
-            <a:graphic xmlns:a="http://schemas.openxmlformats.org/drawingml/2006/main">
-              <a:graphicData uri="http://schemas.openxmlformats.org/drawingml/2006/picture">
-                <pic:pic xmlns:pic="http://schemas.openxmlformats.org/drawingml/2006/picture">
-                  <pic:nvPicPr>
-                    <pic:cNvPr id="914000683" name=""/>
-                    <pic:cNvPicPr/>
-                  </pic:nvPicPr>
-                  <pic:blipFill>
-                    <a:blip r:embed="rId13"/>
-                    <a:stretch>
-                      <a:fillRect/>
-                    </a:stretch>
-                  </pic:blipFill>
-                  <pic:spPr>
-                    <a:xfrm>
-                      <a:off x="0" y="0"/>
-                      <a:ext cx="5760720" cy="2471420"/>
-                    </a:xfrm>
-                    <a:prstGeom prst="rect">
-                      <a:avLst/>
-                    </a:prstGeom>
-                  </pic:spPr>
-                </pic:pic>
-              </a:graphicData>
-            </a:graphic>
-          </wp:inline>
-        </w:drawing>
-      </w:r>
-    </w:p>
-    <w:p/>
-    <w:p/>
-    <w:p/>
-    <w:p/>
-    <w:p>
-      <w:pPr>
-        <w:pStyle w:val="Titre1"/>
-        <w:rPr>
-          <w:noProof/>
-        </w:rPr>
-      </w:pPr>
-      <w:bookmarkStart w:id="3" w:name="_Toc230679308"/>
-      <w:r>
-        <w:rPr>
-          <w:noProof/>
-        </w:rPr>
-        <w:lastRenderedPageBreak/>
-        <w:t>Pourquoi l’algorithmique</w:t>
-      </w:r>
-      <w:bookmarkEnd w:id="3"/>
-    </w:p>
-    <w:p>
-      <w:r>
-        <w:drawing>
-          <wp:inline distT="0" distB="0" distL="0" distR="0" wp14:anchorId="643F1C0B" wp14:editId="4189FBF1">
-            <wp:extent cx="5760720" cy="2222500"/>
-            <wp:effectExtent l="0" t="0" r="0" b="6350"/>
-            <wp:docPr id="652935342" name="Image 1"/>
-            <wp:cNvGraphicFramePr>
-              <a:graphicFrameLocks xmlns:a="http://schemas.openxmlformats.org/drawingml/2006/main" noChangeAspect="1"/>
-            </wp:cNvGraphicFramePr>
-            <a:graphic xmlns:a="http://schemas.openxmlformats.org/drawingml/2006/main">
-              <a:graphicData uri="http://schemas.openxmlformats.org/drawingml/2006/picture">
-                <pic:pic xmlns:pic="http://schemas.openxmlformats.org/drawingml/2006/picture">
-                  <pic:nvPicPr>
-                    <pic:cNvPr id="652935342" name=""/>
-                    <pic:cNvPicPr/>
-                  </pic:nvPicPr>
-                  <pic:blipFill>
-                    <a:blip r:embed="rId14"/>
-                    <a:stretch>
-                      <a:fillRect/>
-                    </a:stretch>
-                  </pic:blipFill>
-                  <pic:spPr>
-                    <a:xfrm>
-                      <a:off x="0" y="0"/>
-                      <a:ext cx="5760720" cy="2222500"/>
-                    </a:xfrm>
-                    <a:prstGeom prst="rect">
-                      <a:avLst/>
-                    </a:prstGeom>
-                  </pic:spPr>
-                </pic:pic>
-              </a:graphicData>
-            </a:graphic>
-          </wp:inline>
-        </w:drawing>
-      </w:r>
-    </w:p>
-    <w:p>
-      <w:pPr>
-        <w:rPr>
-          <w:noProof/>
-        </w:rPr>
-      </w:pPr>
-    </w:p>
     <w:p/>
     <w:sectPr>
-      <w:footerReference w:type="default" r:id="rId15"/>
+      <w:footerReference w:type="default" r:id="rId10"/>
       <w:pgSz w:w="11906" w:h="16838"/>
       <w:pgMar w:top="1417" w:right="1417" w:bottom="1417" w:left="1417" w:header="708" w:footer="708" w:gutter="0"/>
       <w:cols w:space="708"/>

</xml_diff>